<commit_message>
finalizing game design course
</commit_message>
<xml_diff>
--- a/CT60A5401 Game Development Project/Game Design Document-assignment.docx
+++ b/CT60A5401 Game Development Project/Game Design Document-assignment.docx
@@ -208,6 +208,7 @@
           <w:bCs/>
         </w:rPr>
       </w:pPr>
+      <w:proofErr w:type="spellStart"/>
       <w:r>
         <w:rPr>
           <w:b/>
@@ -215,6 +216,7 @@
         </w:rPr>
         <w:t>PaliPali</w:t>
       </w:r>
+      <w:proofErr w:type="spellEnd"/>
     </w:p>
     <w:p>
       <w:pPr>
@@ -386,7 +388,29 @@
           <w:sz w:val="24"/>
           <w:szCs w:val="24"/>
         </w:rPr>
-        <w:t>Summary of the tools used to build PaliPali:</w:t>
+        <w:t xml:space="preserve">Summary of the tools used to build </w:t>
+      </w:r>
+      <w:proofErr w:type="spellStart"/>
+      <w:r>
+        <w:rPr>
+          <w:b/>
+          <w:bCs/>
+          <w:color w:val="404040"/>
+          <w:sz w:val="24"/>
+          <w:szCs w:val="24"/>
+        </w:rPr>
+        <w:t>PaliPali</w:t>
+      </w:r>
+      <w:proofErr w:type="spellEnd"/>
+      <w:r>
+        <w:rPr>
+          <w:b/>
+          <w:bCs/>
+          <w:color w:val="404040"/>
+          <w:sz w:val="24"/>
+          <w:szCs w:val="24"/>
+        </w:rPr>
+        <w:t>:</w:t>
       </w:r>
     </w:p>
     <w:p>
@@ -518,17 +542,7 @@
             <w:sz w:val="24"/>
             <w:szCs w:val="24"/>
           </w:rPr>
-          <w:t>https://</w:t>
-        </w:r>
-        <w:r>
-          <w:rPr>
-            <w:rStyle w:val="Hyperlink"/>
-            <w:b/>
-            <w:bCs/>
-            <w:sz w:val="24"/>
-            <w:szCs w:val="24"/>
-          </w:rPr>
-          <w:t>remove.bg</w:t>
+          <w:t>https://remove.bg</w:t>
         </w:r>
       </w:hyperlink>
       <w:r>
@@ -583,23 +597,44 @@
         </w:pBdr>
         <w:spacing w:before="240" w:after="40" w:line="216" w:lineRule="auto"/>
         <w:rPr>
-          <w:rFonts w:hint="eastAsia"/>
-          <w:b/>
-          <w:bCs/>
-          <w:color w:val="404040"/>
-          <w:sz w:val="24"/>
-          <w:szCs w:val="24"/>
-        </w:rPr>
-      </w:pPr>
-      <w:r>
-        <w:rPr>
-          <w:b/>
-          <w:bCs/>
-          <w:color w:val="404040"/>
-          <w:sz w:val="24"/>
-          <w:szCs w:val="24"/>
-        </w:rPr>
-        <w:t xml:space="preserve">SFX / Music: background and intro music are two tracks from DanAndPhil's copyright-free "All Beats" collection </w:t>
+          <w:b/>
+          <w:bCs/>
+          <w:color w:val="404040"/>
+          <w:sz w:val="24"/>
+          <w:szCs w:val="24"/>
+        </w:rPr>
+      </w:pPr>
+      <w:r>
+        <w:rPr>
+          <w:b/>
+          <w:bCs/>
+          <w:color w:val="404040"/>
+          <w:sz w:val="24"/>
+          <w:szCs w:val="24"/>
+        </w:rPr>
+        <w:t xml:space="preserve">SFX / Music: background and intro music are two tracks from </w:t>
+      </w:r>
+      <w:proofErr w:type="spellStart"/>
+      <w:r>
+        <w:rPr>
+          <w:b/>
+          <w:bCs/>
+          <w:color w:val="404040"/>
+          <w:sz w:val="24"/>
+          <w:szCs w:val="24"/>
+        </w:rPr>
+        <w:t>DanAndPhil's</w:t>
+      </w:r>
+      <w:proofErr w:type="spellEnd"/>
+      <w:r>
+        <w:rPr>
+          <w:b/>
+          <w:bCs/>
+          <w:color w:val="404040"/>
+          <w:sz w:val="24"/>
+          <w:szCs w:val="24"/>
+        </w:rPr>
+        <w:t xml:space="preserve"> copyright-free "All Beats" collection </w:t>
       </w:r>
       <w:r>
         <w:rPr>
@@ -631,27 +666,7 @@
             <w:sz w:val="24"/>
             <w:szCs w:val="24"/>
           </w:rPr>
-          <w:t>https://</w:t>
-        </w:r>
-        <w:r>
-          <w:rPr>
-            <w:rStyle w:val="Hyperlink"/>
-            <w:b/>
-            <w:bCs/>
-            <w:sz w:val="24"/>
-            <w:szCs w:val="24"/>
-          </w:rPr>
-          <w:t>sfxr.me</w:t>
-        </w:r>
-        <w:r>
-          <w:rPr>
-            <w:rStyle w:val="Hyperlink"/>
-            <w:b/>
-            <w:bCs/>
-            <w:sz w:val="24"/>
-            <w:szCs w:val="24"/>
-          </w:rPr>
-          <w:t>/</w:t>
+          <w:t>https://sfxr.me/</w:t>
         </w:r>
       </w:hyperlink>
       <w:r>
@@ -795,6 +810,89 @@
           <w:szCs w:val="24"/>
         </w:rPr>
       </w:pPr>
+      <w:proofErr w:type="spellStart"/>
+      <w:r>
+        <w:rPr>
+          <w:b/>
+          <w:bCs/>
+          <w:color w:val="404040"/>
+          <w:sz w:val="24"/>
+          <w:szCs w:val="24"/>
+        </w:rPr>
+        <w:t>PaliPali</w:t>
+      </w:r>
+      <w:proofErr w:type="spellEnd"/>
+      <w:r>
+        <w:rPr>
+          <w:b/>
+          <w:bCs/>
+          <w:color w:val="404040"/>
+          <w:sz w:val="24"/>
+          <w:szCs w:val="24"/>
+        </w:rPr>
+        <w:t xml:space="preserve"> - Unity Dev Tools &amp; Process Walkthrough</w:t>
+      </w:r>
+      <w:r>
+        <w:rPr>
+          <w:rFonts w:hint="eastAsia"/>
+          <w:b/>
+          <w:bCs/>
+          <w:color w:val="404040"/>
+          <w:sz w:val="24"/>
+          <w:szCs w:val="24"/>
+        </w:rPr>
+        <w:t xml:space="preserve">: </w:t>
+      </w:r>
+      <w:hyperlink r:id="rId9" w:history="1">
+        <w:r>
+          <w:rPr>
+            <w:rStyle w:val="Hyperlink"/>
+            <w:b/>
+            <w:bCs/>
+            <w:sz w:val="24"/>
+            <w:szCs w:val="24"/>
+          </w:rPr>
+          <w:t>https://youtu.be/yWg6DU5MX2Y</w:t>
+        </w:r>
+      </w:hyperlink>
+    </w:p>
+    <w:p>
+      <w:pPr>
+        <w:pBdr>
+          <w:top w:val="nil"/>
+          <w:left w:val="nil"/>
+          <w:bottom w:val="nil"/>
+          <w:right w:val="nil"/>
+          <w:between w:val="nil"/>
+        </w:pBdr>
+        <w:spacing w:before="240" w:after="40" w:line="216" w:lineRule="auto"/>
+        <w:rPr>
+          <w:b/>
+          <w:bCs/>
+          <w:color w:val="404040"/>
+          <w:sz w:val="24"/>
+          <w:szCs w:val="24"/>
+        </w:rPr>
+      </w:pPr>
+    </w:p>
+    <w:p>
+      <w:pPr>
+        <w:pBdr>
+          <w:top w:val="nil"/>
+          <w:left w:val="nil"/>
+          <w:bottom w:val="nil"/>
+          <w:right w:val="nil"/>
+          <w:between w:val="nil"/>
+        </w:pBdr>
+        <w:spacing w:before="240" w:after="40" w:line="216" w:lineRule="auto"/>
+        <w:rPr>
+          <w:b/>
+          <w:bCs/>
+          <w:color w:val="404040"/>
+          <w:sz w:val="24"/>
+          <w:szCs w:val="24"/>
+        </w:rPr>
+      </w:pPr>
       <w:r>
         <w:rPr>
           <w:b/>
@@ -805,7 +903,7 @@
         </w:rPr>
         <w:t xml:space="preserve">Gameplay video: </w:t>
       </w:r>
-      <w:hyperlink r:id="rId9" w:history="1">
+      <w:hyperlink r:id="rId10" w:history="1">
         <w:r>
           <w:rPr>
             <w:rStyle w:val="Hyperlink"/>
@@ -876,7 +974,7 @@
         </w:rPr>
         <w:t xml:space="preserve"> </w:t>
       </w:r>
-      <w:hyperlink r:id="rId10" w:history="1">
+      <w:hyperlink r:id="rId11" w:history="1">
         <w:r>
           <w:rPr>
             <w:rStyle w:val="Hyperlink"/>
@@ -944,31 +1042,41 @@
     </w:p>
     <w:p>
       <w:r>
-        <w:t>PaliPali is a 2D side-scrolling endless runner built in Unity, set in a Korean-flavored cityscape. The player runs automatically past a scrolling skyline and jumps to dodge oncoming enemies</w:t>
+        <w:t>"</w:t>
+      </w:r>
+      <w:proofErr w:type="spellStart"/>
+      <w:r>
+        <w:t>PaliPali</w:t>
+      </w:r>
+      <w:proofErr w:type="spellEnd"/>
+      <w:r>
+        <w:t xml:space="preserve">" is an endless running platformer video game created using Unity, featuring an urban landscape with Korean elements. The user moves continuously through the city landscape and jumps to avoid enemies, namely a delivery driver and a fast-running grandmother (named </w:t>
+      </w:r>
+      <w:proofErr w:type="spellStart"/>
+      <w:r>
+        <w:t>Halmoni</w:t>
+      </w:r>
+      <w:proofErr w:type="spellEnd"/>
+      <w:r>
+        <w:t xml:space="preserve">), and collects Korean foods such as chilies and </w:t>
       </w:r>
       <w:r>
         <w:rPr>
           <w:rFonts w:hint="eastAsia"/>
         </w:rPr>
-        <w:t>,</w:t>
-      </w:r>
-      <w:r>
-        <w:t xml:space="preserve"> a delivery rider and a fast-moving grandmother ("Halmoni")</w:t>
+        <w:t>cabbage</w:t>
+      </w:r>
+      <w:r>
+        <w:t xml:space="preserve"> cabbages which help in increasing health along with a golden </w:t>
       </w:r>
       <w:r>
         <w:rPr>
           <w:rFonts w:hint="eastAsia"/>
         </w:rPr>
-        <w:t>,</w:t>
-      </w:r>
-      <w:r>
-        <w:t xml:space="preserve"> while collecting Korean food items (gochu chili peppers and baechu cabbages) that restore health, plus a rare golden baechu that grants temporary invincibility. The player starts with a limited number of hearts, loses one on enemy contact, and the run ends when hearts reach zero. Survival time, scaled by a chosen difficulty, becomes the score, with food pickups adding bonus points and a persistent high score saved per difficulty. The name comes from the Korean phrase </w:t>
-      </w:r>
-      <w:r>
-        <w:t>빨리빨리</w:t>
-      </w:r>
-      <w:r>
-        <w:t xml:space="preserve"> (ppalli-ppalli, "hurry hurry"), matching the game's ever-accelerating pace.</w:t>
+        <w:t>cabbage</w:t>
+      </w:r>
+      <w:r>
+        <w:t xml:space="preserve"> that gives temporary invincibility. The number of hearts available initially decreases with each encounter with enemies, and once all hearts are lost, the run gets over. The time taken to survive the game, considering the selected difficulty level, forms the score for the game, with bonuses awarded for picking up foods and a high score recorded for each difficulty level.</w:t>
       </w:r>
     </w:p>
     <w:p/>
@@ -981,8 +1089,35 @@
       </w:r>
     </w:p>
     <w:p>
-      <w:r>
-        <w:t>PaliPali is aimed at casual players who enjoy short, pick-up-and-play arcade experiences similar to classic endless runners. Adjustable EASY / NORMAL / HARD difficulty and a choice of two playable characters make it approachable for newcomers while still rewarding skilled play, and built-in tap-input support means it's playable on both desktop and touch devices.</w:t>
+      <w:pPr>
+        <w:rPr>
+          <w:rFonts w:hint="eastAsia"/>
+        </w:rPr>
+      </w:pPr>
+      <w:r>
+        <w:rPr>
+          <w:rFonts w:hint="eastAsia"/>
+        </w:rPr>
+        <w:t>T</w:t>
+      </w:r>
+      <w:r>
+        <w:t xml:space="preserve">he game </w:t>
+      </w:r>
+      <w:proofErr w:type="spellStart"/>
+      <w:r>
+        <w:t>PaliPali</w:t>
+      </w:r>
+      <w:proofErr w:type="spellEnd"/>
+      <w:r>
+        <w:t xml:space="preserve"> is designed for casual gamers who like arcade games that last for shorter periods of time. This includes adjustable difficulty levels (EASY / NORMAL / HARD) and two character options that allow beginners to feel comfortable with playing this game. </w:t>
+      </w:r>
+      <w:proofErr w:type="spellStart"/>
+      <w:r>
+        <w:t>PaliPali</w:t>
+      </w:r>
+      <w:proofErr w:type="spellEnd"/>
+      <w:r>
+        <w:t xml:space="preserve"> includes tap input functionality which makes it compatible with both desktop and touchscreen devices.</w:t>
       </w:r>
     </w:p>
     <w:p>
@@ -1025,7 +1160,39 @@
     </w:p>
     <w:p>
       <w:r>
-        <w:t>The core loop: keep running, jump to dodge enemies, and collect food to stay alive. The player has a set number of hearts (3 or 2, depending on the chosen character); colliding with an enemy costs one heart, colliding with a food item (gochu or baechu) restores one heart, and colliding with the rare golden baechu grants temporary invincibility. The run ends when hearts reach zero. Score is based on survival time scaled by the chosen difficulty's multiplier, plus one bonus point per food item collected. Difficulty (EASY / NORMAL / HARD, chosen with Left/Right arrows) sets the starting speed, maximum speed, ramp rate and score multiplier, and each difficulty tracks its own separate high score via PlayerPrefs.</w:t>
+        <w:t>The core loop: keep running, jump to dodge enemies, and collect food to stay alive. The player has a set number of hearts (3 or 2, depending on the chosen character); colliding with an enemy costs one heart, colliding with a food item (</w:t>
+      </w:r>
+      <w:proofErr w:type="spellStart"/>
+      <w:r>
+        <w:t>gochu</w:t>
+      </w:r>
+      <w:proofErr w:type="spellEnd"/>
+      <w:r>
+        <w:t xml:space="preserve"> or </w:t>
+      </w:r>
+      <w:proofErr w:type="spellStart"/>
+      <w:r>
+        <w:t>baechu</w:t>
+      </w:r>
+      <w:proofErr w:type="spellEnd"/>
+      <w:r>
+        <w:t xml:space="preserve">) restores one heart, and colliding with the rare golden </w:t>
+      </w:r>
+      <w:proofErr w:type="spellStart"/>
+      <w:r>
+        <w:t>baechu</w:t>
+      </w:r>
+      <w:proofErr w:type="spellEnd"/>
+      <w:r>
+        <w:t xml:space="preserve"> grants temporary invincibility. The run ends when hearts reach zero. Score is based on survival time scaled by the chosen difficulty's multiplier, plus one bonus point per food item collected. Difficulty (EASY / NORMAL / HARD, chosen with Left/Right arrows) sets the starting speed, maximum speed, ramp rate and score multiplier, and each difficulty tracks its own separate high score via </w:t>
+      </w:r>
+      <w:proofErr w:type="spellStart"/>
+      <w:r>
+        <w:t>PlayerPrefs</w:t>
+      </w:r>
+      <w:proofErr w:type="spellEnd"/>
+      <w:r>
+        <w:t>.</w:t>
       </w:r>
     </w:p>
     <w:p>
@@ -1038,83 +1205,133 @@
       </w:r>
     </w:p>
     <w:p>
-      <w:r>
-        <w:t>The character moves automatically along a single horizontal axis; the player's only input is jumping (Space bar, mouse click, or touch tap, unified through a shared TapInput script). Pressing jump while grounded launches the character upward with a jump force set by the chosen character. Obstacles, enemies and food scroll toward the player at a speed that ramps up smoothly over time (speed = base + elapsed × rampRate, clamped to a difficulty-specific maximum), so the game gets harder the longer a run lasts.</w:t>
-      </w:r>
-    </w:p>
-    <w:p>
       <w:pPr>
         <w:pStyle w:val="Heading2"/>
+        <w:rPr>
+          <w:sz w:val="22"/>
+          <w:szCs w:val="22"/>
+        </w:rPr>
+      </w:pPr>
+      <w:r>
+        <w:rPr>
+          <w:sz w:val="22"/>
+          <w:szCs w:val="22"/>
+        </w:rPr>
+        <w:t xml:space="preserve">The character will move along a single axis on its own, while the user's only role is to jump using the Space bar, mouse click, or tap on mobile devices, all using the same </w:t>
+      </w:r>
+      <w:proofErr w:type="spellStart"/>
+      <w:r>
+        <w:rPr>
+          <w:sz w:val="22"/>
+          <w:szCs w:val="22"/>
+        </w:rPr>
+        <w:t>TapInput</w:t>
+      </w:r>
+      <w:proofErr w:type="spellEnd"/>
+      <w:r>
+        <w:rPr>
+          <w:sz w:val="22"/>
+          <w:szCs w:val="22"/>
+        </w:rPr>
+        <w:t xml:space="preserve"> component. The action of pressing the jump button while grounded causes the character to jump with a specific jump force depending on the selected character. Obstacles, enemies, and food will approach the player continuously, and the speed will increase over time according to the difficulty level.</w:t>
+      </w:r>
+    </w:p>
+    <w:p>
+      <w:pPr>
+        <w:pStyle w:val="Heading2"/>
       </w:pPr>
       <w:r>
         <w:t xml:space="preserve">  4.3 Physics</w:t>
       </w:r>
     </w:p>
     <w:p>
-      <w:r>
-        <w:t>Movement and collision are handled through Unity's built-in 2D physics engine. The player uses a Rigidbody2D and jumps via an impulse force (AddForce with ForceMode2D.Impulse) combined with Unity's default gravity for a natural arc; a ground-check flag (isGrounded), set via OnCollisionEnter2D against the platform, prevents jumping again mid-air. Enemies and food items use trigger colliders (OnTriggerEnter2D, Is Trigger enabled) tagged by type</w:t>
-      </w:r>
+      <w:pPr>
+        <w:pStyle w:val="Heading2"/>
+        <w:rPr>
+          <w:sz w:val="22"/>
+          <w:szCs w:val="22"/>
+        </w:rPr>
+      </w:pPr>
+      <w:r>
+        <w:rPr>
+          <w:sz w:val="22"/>
+          <w:szCs w:val="22"/>
+        </w:rPr>
+        <w:t xml:space="preserve">The player’s movement and interactions when colliding are performed using Unity’s inbuilt 2D physics engine. The player has a Rigidbody2D that jumps using the impulse force along with Unity’s gravity to make a natural jump; the </w:t>
+      </w:r>
+      <w:proofErr w:type="spellStart"/>
+      <w:r>
+        <w:rPr>
+          <w:sz w:val="22"/>
+          <w:szCs w:val="22"/>
+        </w:rPr>
+        <w:t>isGrounded</w:t>
+      </w:r>
+      <w:proofErr w:type="spellEnd"/>
+      <w:r>
+        <w:rPr>
+          <w:sz w:val="22"/>
+          <w:szCs w:val="22"/>
+        </w:rPr>
+        <w:t xml:space="preserve"> parameter, checked using OnCollisionEnter2D on the platforms, will not allow the player to jump again while in air.</w:t>
+      </w:r>
+    </w:p>
+    <w:p>
+      <w:pPr>
+        <w:pStyle w:val="Heading2"/>
+      </w:pPr>
       <w:r>
         <w:rPr>
           <w:rFonts w:hint="eastAsia"/>
-        </w:rPr>
-        <w:t>,</w:t>
-      </w:r>
-      <w:r>
-        <w:t xml:space="preserve"> enemy, food, golden </w:t>
+          <w:lang w:val="en-FI"/>
+        </w:rPr>
+        <w:t xml:space="preserve">  </w:t>
+      </w:r>
+      <w:r>
+        <w:rPr>
+          <w:lang w:val="en-FI"/>
+        </w:rPr>
+        <w:t>4.4 Multiplayer Mode</w:t>
+      </w:r>
+    </w:p>
+    <w:p>
+      <w:pPr>
+        <w:rPr>
+          <w:lang w:val="en-FI"/>
+        </w:rPr>
+      </w:pPr>
+      <w:r>
+        <w:rPr>
+          <w:lang w:val="en-FI"/>
+        </w:rPr>
+        <w:t xml:space="preserve">None </w:t>
       </w:r>
       <w:r>
         <w:rPr>
           <w:rFonts w:hint="eastAsia"/>
+          <w:lang w:val="en-FI"/>
         </w:rPr>
         <w:t>-</w:t>
       </w:r>
       <w:r>
-        <w:t xml:space="preserve"> so the player script's Hit(), Heal() and StartInvincible() functions can react to each one differently.</w:t>
-      </w:r>
-    </w:p>
-    <w:p>
-      <w:pPr>
-        <w:pStyle w:val="Heading2"/>
-      </w:pPr>
-      <w:r>
-        <w:rPr>
-          <w:rFonts w:hint="eastAsia"/>
-          <w:lang w:val="en-FI"/>
-        </w:rPr>
-        <w:t xml:space="preserve">  </w:t>
-      </w:r>
-      <w:r>
-        <w:rPr>
-          <w:lang w:val="en-FI"/>
-        </w:rPr>
-        <w:t>4.4 Multiplayer Mode</w:t>
-      </w:r>
-    </w:p>
-    <w:p>
-      <w:pPr>
-        <w:rPr>
-          <w:lang w:val="en-FI"/>
-        </w:rPr>
-      </w:pPr>
-      <w:r>
-        <w:rPr>
-          <w:lang w:val="en-FI"/>
-        </w:rPr>
-        <w:t xml:space="preserve">None </w:t>
-      </w:r>
-      <w:r>
-        <w:rPr>
-          <w:rFonts w:hint="eastAsia"/>
-          <w:lang w:val="en-FI"/>
-        </w:rPr>
-        <w:t>-</w:t>
-      </w:r>
-      <w:r>
-        <w:rPr>
-          <w:lang w:val="en-FI"/>
-        </w:rPr>
-        <w:t xml:space="preserve"> PaliPali is a single-player experience only.</w:t>
+        <w:rPr>
+          <w:lang w:val="en-FI"/>
+        </w:rPr>
+        <w:t xml:space="preserve"> </w:t>
+      </w:r>
+      <w:proofErr w:type="spellStart"/>
+      <w:r>
+        <w:rPr>
+          <w:lang w:val="en-FI"/>
+        </w:rPr>
+        <w:t>PaliPali</w:t>
+      </w:r>
+      <w:proofErr w:type="spellEnd"/>
+      <w:r>
+        <w:rPr>
+          <w:lang w:val="en-FI"/>
+        </w:rPr>
+        <w:t xml:space="preserve"> is a single-player experience only.</w:t>
       </w:r>
     </w:p>
     <w:p>
@@ -1133,8 +1350,21 @@
       </w:r>
     </w:p>
     <w:p>
-      <w:r>
-        <w:t xml:space="preserve">PaliPali is a 2D side-scrolling endless runner set in a stylized, Korean-flavored pixel-art cityscape. Three parallax background layers </w:t>
+      <w:proofErr w:type="spellStart"/>
+      <w:r>
+        <w:t>PaliPali</w:t>
+      </w:r>
+      <w:proofErr w:type="spellEnd"/>
+      <w:r>
+        <w:t xml:space="preserve"> is a 2D side-scrolling endless runner set in a stylized, Korean-</w:t>
+      </w:r>
+      <w:proofErr w:type="spellStart"/>
+      <w:r>
+        <w:t>flavored</w:t>
+      </w:r>
+      <w:proofErr w:type="spellEnd"/>
+      <w:r>
+        <w:t xml:space="preserve"> pixel-art cityscape. Three parallax background layers </w:t>
       </w:r>
       <w:r>
         <w:rPr>
@@ -1178,7 +1408,7 @@
                     </pic:cNvPicPr>
                   </pic:nvPicPr>
                   <pic:blipFill>
-                    <a:blip r:embed="rId11">
+                    <a:blip r:embed="rId12">
                       <a:extLst>
                         <a:ext uri="{28A0092B-C50C-407E-A947-70E740481C1C}">
                           <a14:useLocalDpi xmlns:a14="http://schemas.microsoft.com/office/drawing/2010/main" val="0"/>
@@ -1231,7 +1461,7 @@
                     </pic:cNvPicPr>
                   </pic:nvPicPr>
                   <pic:blipFill>
-                    <a:blip r:embed="rId12" cstate="print">
+                    <a:blip r:embed="rId13" cstate="print">
                       <a:extLst>
                         <a:ext uri="{28A0092B-C50C-407E-A947-70E740481C1C}">
                           <a14:useLocalDpi xmlns:a14="http://schemas.microsoft.com/office/drawing/2010/main" val="0"/>
@@ -1284,7 +1514,7 @@
                     </pic:cNvPicPr>
                   </pic:nvPicPr>
                   <pic:blipFill>
-                    <a:blip r:embed="rId13">
+                    <a:blip r:embed="rId14">
                       <a:extLst>
                         <a:ext uri="{28A0092B-C50C-407E-A947-70E740481C1C}">
                           <a14:useLocalDpi xmlns:a14="http://schemas.microsoft.com/office/drawing/2010/main" val="0"/>
@@ -1337,7 +1567,7 @@
                     </pic:cNvPicPr>
                   </pic:nvPicPr>
                   <pic:blipFill>
-                    <a:blip r:embed="rId14">
+                    <a:blip r:embed="rId15">
                       <a:extLst>
                         <a:ext uri="{28A0092B-C50C-407E-A947-70E740481C1C}">
                           <a14:useLocalDpi xmlns:a14="http://schemas.microsoft.com/office/drawing/2010/main" val="0"/>
@@ -1379,8 +1609,45 @@
       </w:r>
     </w:p>
     <w:p>
-      <w:r>
-        <w:t>PaliPali features two enemy types that spawn and scroll toward the player: a delivery-rider enemy and a fast-moving Halmoni (grandmother) enemy, both of which cost the player a heart on contact. Three collectible food objects counter these: gochu (chili pepper) and baechu (cabbage), which each restore one heart, and a rare golden baechu, which grants the player temporary invincibility. Buildings/obstacles, enemies and food are each driven by a shared Spawner / Mover / Destroyer script trio living on dedicated spawner objects (a building spawner, an enemy spawner, and food/gold spawners), with every prefab tagged by type so the player's trigger-collision logic can respond correctly.</w:t>
+      <w:proofErr w:type="spellStart"/>
+      <w:r>
+        <w:t>PaliPali</w:t>
+      </w:r>
+      <w:proofErr w:type="spellEnd"/>
+      <w:r>
+        <w:t xml:space="preserve"> features two enemy types that spawn and scroll toward the player: a delivery-rider enemy and a fast-moving </w:t>
+      </w:r>
+      <w:proofErr w:type="spellStart"/>
+      <w:r>
+        <w:t>Halmoni</w:t>
+      </w:r>
+      <w:proofErr w:type="spellEnd"/>
+      <w:r>
+        <w:t xml:space="preserve"> (grandmother) enemy, both of which cost the player a heart on contact. Three collectible food objects counter these: </w:t>
+      </w:r>
+      <w:proofErr w:type="spellStart"/>
+      <w:r>
+        <w:t>gochu</w:t>
+      </w:r>
+      <w:proofErr w:type="spellEnd"/>
+      <w:r>
+        <w:t xml:space="preserve"> (chili pepper) and </w:t>
+      </w:r>
+      <w:proofErr w:type="spellStart"/>
+      <w:r>
+        <w:t>baechu</w:t>
+      </w:r>
+      <w:proofErr w:type="spellEnd"/>
+      <w:r>
+        <w:t xml:space="preserve"> (cabbage), which each restore one heart, and a rare golden </w:t>
+      </w:r>
+      <w:proofErr w:type="spellStart"/>
+      <w:r>
+        <w:t>baechu</w:t>
+      </w:r>
+      <w:proofErr w:type="spellEnd"/>
+      <w:r>
+        <w:t>, which grants the player temporary invincibility. Buildings/obstacles, enemies and food are each driven by a shared Spawner / Mover / Destroyer script trio living on dedicated spawner objects (a building spawner, an enemy spawner, and food/gold spawners), with every prefab tagged by type so the player's trigger-collision logic can respond correctly.</w:t>
       </w:r>
     </w:p>
     <w:p/>
@@ -1401,8 +1668,13 @@
       </w:r>
     </w:p>
     <w:p>
-      <w:r>
-        <w:t>PaliPali doesn't carry a deep narrative, in keeping with its small arcade scope: the player is simply trying to get through a hectic, obstacle-filled city as fast</w:t>
+      <w:proofErr w:type="spellStart"/>
+      <w:r>
+        <w:t>PaliPali</w:t>
+      </w:r>
+      <w:proofErr w:type="spellEnd"/>
+      <w:r>
+        <w:t xml:space="preserve"> doesn't carry a deep narrative, in keeping with its small arcade scope: the player is simply trying to get through a hectic, obstacle-filled city as fast</w:t>
       </w:r>
       <w:r>
         <w:rPr>
@@ -1439,7 +1711,23 @@
     </w:p>
     <w:p>
       <w:r>
-        <w:t>Rather than discrete worlds or stages, PaliPali is a single continuous run whose challenge escalates smoothly over time: speed ramps up the longer the player survives (base + elapsed × rampRate, capped at a difficulty-specific maximum). The player sets their starting challenge level up front via the EASY / NORMAL / HARD difficulty selector on the title screen, each with its own starting speed, ramp rate, max speed and score multiplier.</w:t>
+        <w:t xml:space="preserve">Rather than discrete worlds or stages, </w:t>
+      </w:r>
+      <w:proofErr w:type="spellStart"/>
+      <w:r>
+        <w:t>PaliPali</w:t>
+      </w:r>
+      <w:proofErr w:type="spellEnd"/>
+      <w:r>
+        <w:t xml:space="preserve"> is a single continuous run whose challenge escalates smoothly over time: speed ramps up the longer the player survives (base + elapsed × </w:t>
+      </w:r>
+      <w:proofErr w:type="spellStart"/>
+      <w:r>
+        <w:t>rampRate</w:t>
+      </w:r>
+      <w:proofErr w:type="spellEnd"/>
+      <w:r>
+        <w:t>, capped at a difficulty-specific maximum). The player sets their starting challenge level up front via the EASY / NORMAL / HARD difficulty selector on the title screen, each with its own starting speed, ramp rate, max speed and score multiplier.</w:t>
       </w:r>
     </w:p>
     <w:p>
@@ -1477,7 +1765,7 @@
         </w:rPr>
         <w:t xml:space="preserve"> </w:t>
       </w:r>
-      <w:hyperlink r:id="rId15" w:history="1">
+      <w:hyperlink r:id="rId16" w:history="1">
         <w:r>
           <w:rPr>
             <w:rStyle w:val="Hyperlink"/>
@@ -1508,7 +1796,19 @@
     </w:p>
     <w:p>
       <w:r>
-        <w:t>Keyboard: Space bar to jump / start / restart; Left/Right arrows to pick a difficulty; Up/Down arrows to pick a character on the title screen. Mouse click and touch tap are unified with the space bar through a shared TapInput script, so jumping, starting, restarting, and difficulty/character selection are all also fully usable on touch devices</w:t>
+        <w:t xml:space="preserve">Keyboard: Press Space to jump/start/restart; use Left/Right keys to select the difficulty; use Up/Down keys to select the character from the main menu. Click/Mouse and Touch actions are merged with the Space button through a single </w:t>
+      </w:r>
+      <w:proofErr w:type="spellStart"/>
+      <w:r>
+        <w:t>TapInput</w:t>
+      </w:r>
+      <w:proofErr w:type="spellEnd"/>
+      <w:r>
+        <w:t xml:space="preserve"> script. This means that jumping, </w:t>
+      </w:r>
+      <w:r>
+        <w:lastRenderedPageBreak/>
+        <w:t>starting, restarting, and selecting the difficulty and character are also available on touchscreen devices.</w:t>
       </w:r>
     </w:p>
     <w:p>
@@ -1516,13 +1816,28 @@
         <w:pStyle w:val="Heading2"/>
       </w:pPr>
       <w:r>
-        <w:lastRenderedPageBreak/>
         <w:t xml:space="preserve">  8.3 Limitations</w:t>
       </w:r>
     </w:p>
     <w:p>
       <w:r>
-        <w:t>As a course project, PaliPali is scoped to a single continuous endless-runner level rather than multiple discrete levels or worlds, and does not include a dedicated Android build even though the interface is touch-compatible in-browser. Progress is not saved beyond the high score, which persists locally per difficulty via PlayerPrefs.</w:t>
+        <w:t xml:space="preserve">As a course project, </w:t>
+      </w:r>
+      <w:proofErr w:type="spellStart"/>
+      <w:r>
+        <w:t>PaliPali</w:t>
+      </w:r>
+      <w:proofErr w:type="spellEnd"/>
+      <w:r>
+        <w:t xml:space="preserve"> is scoped to a single continuous endless-runner level rather than multiple discrete levels or worlds, and does not include a dedicated Android build even though the interface is touch-compatible in-browser. Progress is not saved beyond the high score, which persists locally per difficulty via </w:t>
+      </w:r>
+      <w:proofErr w:type="spellStart"/>
+      <w:r>
+        <w:t>PlayerPrefs</w:t>
+      </w:r>
+      <w:proofErr w:type="spellEnd"/>
+      <w:r>
+        <w:t>.</w:t>
       </w:r>
     </w:p>
     <w:p>
@@ -1555,7 +1870,15 @@
         <w:t>.</w:t>
       </w:r>
       <w:r>
-        <w:t xml:space="preserve"> PaliPali is a free, non-commercial student project.</w:t>
+        <w:t xml:space="preserve"> </w:t>
+      </w:r>
+      <w:proofErr w:type="spellStart"/>
+      <w:r>
+        <w:t>PaliPali</w:t>
+      </w:r>
+      <w:proofErr w:type="spellEnd"/>
+      <w:r>
+        <w:t xml:space="preserve"> is a free, non-commercial student project.</w:t>
       </w:r>
     </w:p>
     <w:p>
@@ -1624,7 +1947,7 @@
         </w:rPr>
         <w:t xml:space="preserve"> YouTuber Nomad Coder (</w:t>
       </w:r>
-      <w:hyperlink r:id="rId16" w:history="1">
+      <w:hyperlink r:id="rId17" w:history="1">
         <w:r>
           <w:rPr>
             <w:rStyle w:val="Hyperlink"/>
@@ -1665,7 +1988,7 @@
         </w:rPr>
         <w:t xml:space="preserve"> base image generated with Google Gemini (AI image generation), background removed with </w:t>
       </w:r>
-      <w:hyperlink r:id="rId17" w:history="1">
+      <w:hyperlink r:id="rId18" w:history="1">
         <w:r>
           <w:rPr>
             <w:rStyle w:val="Hyperlink"/>
@@ -1704,9 +2027,23 @@
         <w:rPr>
           <w:lang w:val="en-FI"/>
         </w:rPr>
-        <w:t xml:space="preserve"> "You Won't Believe What Happened" and "Ready Player Two" by DanAndPhil, from their copyright-free "All Beats" collection (</w:t>
-      </w:r>
-      <w:hyperlink r:id="rId18" w:history="1">
+        <w:t xml:space="preserve"> "You Won't Believe What Happened" and "Ready Player Two" by </w:t>
+      </w:r>
+      <w:proofErr w:type="spellStart"/>
+      <w:r>
+        <w:rPr>
+          <w:lang w:val="en-FI"/>
+        </w:rPr>
+        <w:t>DanAndPhil</w:t>
+      </w:r>
+      <w:proofErr w:type="spellEnd"/>
+      <w:r>
+        <w:rPr>
+          <w:lang w:val="en-FI"/>
+        </w:rPr>
+        <w:t>, from their copyright-free "All Beats" collection (</w:t>
+      </w:r>
+      <w:hyperlink r:id="rId19" w:history="1">
         <w:r>
           <w:rPr>
             <w:rStyle w:val="Hyperlink"/>
@@ -1721,20 +2058,13 @@
         </w:rPr>
         <w:t xml:space="preserve">, </w:t>
       </w:r>
-      <w:hyperlink r:id="rId19" w:history="1">
+      <w:hyperlink r:id="rId20" w:history="1">
         <w:r>
           <w:rPr>
             <w:rStyle w:val="Hyperlink"/>
             <w:lang w:val="en-FI"/>
           </w:rPr>
-          <w:t>https://</w:t>
-        </w:r>
-        <w:r>
-          <w:rPr>
-            <w:rStyle w:val="Hyperlink"/>
-            <w:lang w:val="en-FI"/>
-          </w:rPr>
-          <w:t>youtu.be/OTeHBM7h7Hw</w:t>
+          <w:t>https://youtu.be/OTeHBM7h7Hw</w:t>
         </w:r>
       </w:hyperlink>
       <w:r>
@@ -1769,7 +2099,7 @@
         </w:rPr>
         <w:t xml:space="preserve"> 5 custom SFX (jump, hit, eat, power-up, game over) created with the </w:t>
       </w:r>
-      <w:hyperlink r:id="rId20" w:history="1">
+      <w:hyperlink r:id="rId21" w:history="1">
         <w:r>
           <w:rPr>
             <w:rStyle w:val="Hyperlink"/>
@@ -1795,7 +2125,21 @@
         <w:rPr>
           <w:lang w:val="en-FI"/>
         </w:rPr>
-        <w:t xml:space="preserve">• Unity Input System and TextMeshPro </w:t>
+        <w:t xml:space="preserve">• Unity Input System and </w:t>
+      </w:r>
+      <w:proofErr w:type="spellStart"/>
+      <w:r>
+        <w:rPr>
+          <w:lang w:val="en-FI"/>
+        </w:rPr>
+        <w:t>TextMeshPro</w:t>
+      </w:r>
+      <w:proofErr w:type="spellEnd"/>
+      <w:r>
+        <w:rPr>
+          <w:lang w:val="en-FI"/>
+        </w:rPr>
+        <w:t xml:space="preserve"> </w:t>
       </w:r>
       <w:r>
         <w:rPr>
@@ -2556,6 +2900,7 @@
   <w:style w:type="character" w:default="1" w:styleId="DefaultParagraphFont">
     <w:name w:val="Default Paragraph Font"/>
     <w:uiPriority w:val="1"/>
+    <w:semiHidden/>
     <w:unhideWhenUsed/>
   </w:style>
   <w:style w:type="table" w:default="1" w:styleId="TableNormal">

</xml_diff>